<commit_message>
Add WhatsApp CSV batches and correct spoken names and English dates
</commit_message>
<xml_diff>
--- a/docs/Voice_Reminder_Proposal_Summary.docx
+++ b/docs/Voice_Reminder_Proposal_Summary.docx
@@ -30,7 +30,7 @@
     </w:p>
     <w:p>
       <w:r>
-        <w:t>The proposed system prepares polite, personalized voice reminders and distributes them through a messaging channel. A reusable Python service turns an approved text template into an MP3 recording, while n8n coordinates the workflow. The prototype demonstrates CSV-based email reminders and a separate WhatsApp audio test using fictional customer details.</w:t>
+        <w:t>The proposed system prepares polite, personalized voice reminders and distributes them through a messaging channel. A reusable Python service turns an approved text template into an MP3 recording, while n8n coordinates the workflow. The prototype demonstrates CSV-based email and WhatsApp audio reminders using fictional customer details.</w:t>
       </w:r>
     </w:p>
     <w:p>
@@ -54,7 +54,7 @@
         <w:pStyle w:val="ListNumber"/>
       </w:pPr>
       <w:r>
-        <w:t>For the email workflow, select eligible records and check processing history to avoid duplicate reminders.</w:t>
+        <w:t>Select eligible records and skip duplicate CSV rows. The email workflow also checks durable processing history to prevent repeated reminders.</w:t>
       </w:r>
     </w:p>
     <w:p>
@@ -104,7 +104,7 @@
     </w:p>
     <w:p>
       <w:r>
-        <w:t>The separate WhatsApp workflow generates one fictional recording per manual execution. It uploaded an MP3 through Meta Cloud API, received an accepted submission, and the test recipient confirmed receipt of the recording in WhatsApp. Sending Hello opens the reply window; it does not automatically trigger n8n.</w:t>
+        <w:t>The separate WhatsApp workflow creates one recording per eligible CSV customer and routes all messages to a verified test phone. A live test confirmed receipt in WhatsApp. A subsequent CSV preview produced four different recordings and skipped invalid, ineligible and duplicate rows. Sending Hello opens the reply window; execution remains manual.</w:t>
       </w:r>
     </w:p>
     <w:p>
@@ -667,7 +667,7 @@
     </w:p>
     <w:p>
       <w:r>
-        <w:t>The spoken script is an editable text template shared by both channels. Supported fields are {first_name}, {agent_name}, {bank_name} and {due_date}. Changing the template requires rebuilding the speech service container. No LLM or paid generative AI API is used to compose the script.</w:t>
+        <w:t>The spoken script is an editable text template shared by both channels. Supported fields are {first_name}, {agent_name}, {bank_name} and {due_date}. Filipino speech uses English words for dates. Changing the template requires rebuilding the speech service container. No LLM or paid generative AI API is used to compose the script.</w:t>
       </w:r>
     </w:p>
     <w:p>
@@ -680,7 +680,7 @@
     </w:p>
     <w:p>
       <w:r>
-        <w:t>The WhatsApp demonstration uses a Meta test sender and a verified recipient within the 24-hour reply window. It has no customer batch, automatic inbound trigger, durable duplicate prevention or delivery webhooks; each manual execution is a new send attempt. Provider acceptance does not establish that audio was played.</w:t>
+        <w:t>The WhatsApp demonstration uses a Meta test sender and a verified recipient within the 24-hour reply window. It skips duplicate customer and due-date rows within each CSV batch. Each manual execution is a new batch; durable duplicate tracking across runs, automatic inbound triggers and delivery webhooks remain future work. Provider acceptance does not establish that audio was played.</w:t>
       </w:r>
     </w:p>
     <w:p>

</xml_diff>